<commit_message>
Switch to text-based meta generation
</commit_message>
<xml_diff>
--- a/templates/meta_template.docx
+++ b/templates/meta_template.docx
@@ -1,100 +1,86 @@
 
 <file path=word/document.xml><?xml version="1.0" encoding="utf-8"?>
-<w:document xmlns:mc="http://schemas.openxmlformats.org/markup-compatibility/2006" xmlns:o="urn:schemas-microsoft-com:office:office" xmlns:r="http://schemas.openxmlformats.org/officeDocument/2006/relationships" xmlns:m="http://schemas.openxmlformats.org/officeDocument/2006/math" xmlns:v="urn:schemas-microsoft-com:vml" xmlns:wp="http://schemas.openxmlformats.org/drawingml/2006/wordprocessingDrawing" xmlns:w10="urn:schemas-microsoft-com:office:word" xmlns:w="http://schemas.openxmlformats.org/wordprocessingml/2006/main" xmlns:wne="http://schemas.microsoft.com/office/word/2006/wordml" xmlns:sl="http://schemas.openxmlformats.org/schemaLibrary/2006/main" xmlns:a="http://schemas.openxmlformats.org/drawingml/2006/main" xmlns:pic="http://schemas.openxmlformats.org/drawingml/2006/picture" xmlns:c="http://schemas.openxmlformats.org/drawingml/2006/chart" xmlns:lc="http://schemas.openxmlformats.org/drawingml/2006/lockedCanvas" xmlns:dgm="http://schemas.openxmlformats.org/drawingml/2006/diagram" xmlns:wps="http://schemas.microsoft.com/office/word/2010/wordprocessingShape" xmlns:wpg="http://schemas.microsoft.com/office/word/2010/wordprocessingGroup" xmlns:w14="http://schemas.microsoft.com/office/word/2010/wordml" xmlns:w15="http://schemas.microsoft.com/office/word/2012/wordml" xmlns:w16="http://schemas.microsoft.com/office/word/2018/wordml" xmlns:w16cex="http://schemas.microsoft.com/office/word/2018/wordml/cex" xmlns:w16cid="http://schemas.microsoft.com/office/word/2016/wordml/cid" xmlns="http://schemas.microsoft.com/office/tasks/2019/documenttasks" xmlns:cr="http://schemas.microsoft.com/office/comments/2020/reactions">
+<w:document xmlns:ns1="http://schemas.openxmlformats.org/markup-compatibility/2006" xmlns:w="http://schemas.openxmlformats.org/wordprocessingml/2006/main" ns1:Ignorable="w14 w15 w16se wp14">
   <w:body>
     <w:p>
-      <w:pPr>
-        <w:rPr>
-          <w:highlight w:val="yellow"/>
-        </w:rPr>
-      </w:pPr>
-      <w:r>
-        <w:rPr>
-          <w:highlight w:val="yellow"/>
-          <w:rtl w:val="0"/>
-        </w:rPr>
-        <w:t xml:space="preserve">重點標</w:t>
-      </w:r>
-    </w:p>
-    <w:p>
-      <w:pPr>
-        <w:rPr/>
-      </w:pPr>
+      <w:r>
+        <w:t>重點標</w:t>
+      </w:r>
+    </w:p>
+    <w:p>
       <w:r>
         <w:t>{{TITLE_EN}}</w:t>
       </w:r>
     </w:p>
-    <w:p>
-      <w:pPr>
-        <w:rPr/>
-      </w:pPr>
-      <w:r>
-        <w:rPr>
-          <w:rtl w:val="0"/>
-        </w:rPr>
-      </w:r>
-    </w:p>
-    <w:p>
-      <w:pPr>
-        <w:rPr>
-          <w:highlight w:val="yellow"/>
-        </w:rPr>
-      </w:pPr>
-      <w:r>
-        <w:rPr>
-          <w:highlight w:val="yellow"/>
-          <w:rtl w:val="0"/>
-        </w:rPr>
-        <w:t xml:space="preserve">名字職銜</w:t>
-      </w:r>
-    </w:p>
-    <w:p>
-      <w:r/>
-    </w:p>
+    <w:p/>
+    <w:p>
+      <w:r>
+        <w:t>名字職銜</w:t>
+      </w:r>
+    </w:p>
+    <w:p/>
     <w:p>
       <w:r>
         <w:t>{{PEOPLE}}</w:t>
       </w:r>
     </w:p>
-    <w:p>
-      <w:r/>
-    </w:p>
-    <w:p>
-      <w:pPr>
-        <w:rPr/>
-      </w:pPr>
-      <w:r>
-        <w:rPr>
-          <w:highlight w:val="yellow"/>
-          <w:rtl w:val="0"/>
-        </w:rPr>
-        <w:t xml:space="preserve">YT簡介</w:t>
-      </w:r>
-      <w:r>
-        <w:rPr>
-          <w:rtl w:val="0"/>
-        </w:rPr>
-      </w:r>
-    </w:p>
-    <w:p>
-      <w:pPr>
-        <w:rPr/>
-      </w:pPr>
+    <w:p/>
+    <w:p>
+      <w:r>
+        <w:t>YT簡介</w:t>
+      </w:r>
+    </w:p>
+    <w:p>
       <w:r>
         <w:t>{{OVERVIEW_EN}}</w:t>
       </w:r>
     </w:p>
     <w:sectPr>
-      <w:pgSz w:h="16838" w:w="11906" w:orient="portrait"/>
-      <w:pgMar w:bottom="1440" w:top="1440" w:left="1440" w:right="1440" w:header="0" w:footer="0"/>
-      <w:pgNumType w:start="1"/>
+      <w:pgSz w:w="11906" w:h="16838"/>
+      <w:pgMar w:top="1440" w:right="1153" w:bottom="1440" w:left="1153" w:header="851" w:footer="992" w:gutter="0"/>
+      <w:cols w:space="425"/>
+      <w:docGrid w:type="lines" w:linePitch="360"/>
     </w:sectPr>
   </w:body>
 </w:document>
 </file>
 
-<file path=word/numbering.xml><?xml version="1.0" encoding="utf-8"?>
-<w:numbering xmlns:mc="http://schemas.openxmlformats.org/markup-compatibility/2006" xmlns:o="urn:schemas-microsoft-com:office:office" xmlns:r="http://schemas.openxmlformats.org/officeDocument/2006/relationships" xmlns:m="http://schemas.openxmlformats.org/officeDocument/2006/math" xmlns:v="urn:schemas-microsoft-com:vml" xmlns:wp="http://schemas.openxmlformats.org/drawingml/2006/wordprocessingDrawing" xmlns:w10="urn:schemas-microsoft-com:office:word" xmlns:w="http://schemas.openxmlformats.org/wordprocessingml/2006/main" xmlns:wne="http://schemas.microsoft.com/office/word/2006/wordml" xmlns:sl="http://schemas.openxmlformats.org/schemaLibrary/2006/main" xmlns:a="http://schemas.openxmlformats.org/drawingml/2006/main" xmlns:pic="http://schemas.openxmlformats.org/drawingml/2006/picture" xmlns:c="http://schemas.openxmlformats.org/drawingml/2006/chart" xmlns:lc="http://schemas.openxmlformats.org/drawingml/2006/lockedCanvas" xmlns:dgm="http://schemas.openxmlformats.org/drawingml/2006/diagram" xmlns:wps="http://schemas.microsoft.com/office/word/2010/wordprocessingShape" xmlns:wpg="http://schemas.microsoft.com/office/word/2010/wordprocessingGroup" xmlns:w14="http://schemas.microsoft.com/office/word/2010/wordml" xmlns:w15="http://schemas.microsoft.com/office/word/2012/wordml" xmlns:w16="http://schemas.microsoft.com/office/word/2018/wordml" xmlns:w16cex="http://schemas.microsoft.com/office/word/2018/wordml/cex" xmlns:w16cid="http://schemas.microsoft.com/office/word/2016/wordml/cid" xmlns="http://schemas.microsoft.com/office/tasks/2019/documenttasks" xmlns:cr="http://schemas.microsoft.com/office/comments/2020/reactions"/>
+<file path=word/endnotes.xml><?xml version="1.0" encoding="utf-8"?>
+<w:endnotes xmlns:wpc="http://schemas.microsoft.com/office/word/2010/wordprocessingCanvas" xmlns:cx="http://schemas.microsoft.com/office/drawing/2014/chartex" xmlns:mc="http://schemas.openxmlformats.org/markup-compatibility/2006" xmlns:o="urn:schemas-microsoft-com:office:office" xmlns:r="http://schemas.openxmlformats.org/officeDocument/2006/relationships" xmlns:m="http://schemas.openxmlformats.org/officeDocument/2006/math" xmlns:v="urn:schemas-microsoft-com:vml" xmlns:wp14="http://schemas.microsoft.com/office/word/2010/wordprocessingDrawing" xmlns:wp="http://schemas.openxmlformats.org/drawingml/2006/wordprocessingDrawing" xmlns:w10="urn:schemas-microsoft-com:office:word" xmlns:w="http://schemas.openxmlformats.org/wordprocessingml/2006/main" xmlns:w14="http://schemas.microsoft.com/office/word/2010/wordml" xmlns:w15="http://schemas.microsoft.com/office/word/2012/wordml" xmlns:w16se="http://schemas.microsoft.com/office/word/2015/wordml/symex" xmlns:wpg="http://schemas.microsoft.com/office/word/2010/wordprocessingGroup" xmlns:wpi="http://schemas.microsoft.com/office/word/2010/wordprocessingInk" xmlns:wne="http://schemas.microsoft.com/office/word/2006/wordml" xmlns:wps="http://schemas.microsoft.com/office/word/2010/wordprocessingShape" mc:Ignorable="w14 w15 w16se wp14">
+  <w:endnote w:type="separator" w:id="-1">
+    <w:p>
+      <w:r>
+        <w:separator/>
+      </w:r>
+    </w:p>
+  </w:endnote>
+  <w:endnote w:type="continuationSeparator" w:id="0">
+    <w:p>
+      <w:r>
+        <w:continuationSeparator/>
+      </w:r>
+    </w:p>
+  </w:endnote>
+</w:endnotes>
+</file>
+
+<file path=word/footnotes.xml><?xml version="1.0" encoding="utf-8"?>
+<w:footnotes xmlns:wpc="http://schemas.microsoft.com/office/word/2010/wordprocessingCanvas" xmlns:cx="http://schemas.microsoft.com/office/drawing/2014/chartex" xmlns:mc="http://schemas.openxmlformats.org/markup-compatibility/2006" xmlns:o="urn:schemas-microsoft-com:office:office" xmlns:r="http://schemas.openxmlformats.org/officeDocument/2006/relationships" xmlns:m="http://schemas.openxmlformats.org/officeDocument/2006/math" xmlns:v="urn:schemas-microsoft-com:vml" xmlns:wp14="http://schemas.microsoft.com/office/word/2010/wordprocessingDrawing" xmlns:wp="http://schemas.openxmlformats.org/drawingml/2006/wordprocessingDrawing" xmlns:w10="urn:schemas-microsoft-com:office:word" xmlns:w="http://schemas.openxmlformats.org/wordprocessingml/2006/main" xmlns:w14="http://schemas.microsoft.com/office/word/2010/wordml" xmlns:w15="http://schemas.microsoft.com/office/word/2012/wordml" xmlns:w16se="http://schemas.microsoft.com/office/word/2015/wordml/symex" xmlns:wpg="http://schemas.microsoft.com/office/word/2010/wordprocessingGroup" xmlns:wpi="http://schemas.microsoft.com/office/word/2010/wordprocessingInk" xmlns:wne="http://schemas.microsoft.com/office/word/2006/wordml" xmlns:wps="http://schemas.microsoft.com/office/word/2010/wordprocessingShape" mc:Ignorable="w14 w15 w16se wp14">
+  <w:footnote w:type="separator" w:id="-1">
+    <w:p>
+      <w:r>
+        <w:separator/>
+      </w:r>
+    </w:p>
+  </w:footnote>
+  <w:footnote w:type="continuationSeparator" w:id="0">
+    <w:p>
+      <w:r>
+        <w:continuationSeparator/>
+      </w:r>
+    </w:p>
+  </w:footnote>
+</w:footnotes>
 </file>
 
 <file path=word/styles.xml><?xml version="1.0" encoding="utf-8"?>
@@ -880,19 +866,4 @@
     </a:ext>
   </a:extLst>
 </a:theme>
-</file>
-
-<file path=customXML/item1.xml><?xml version="1.0" encoding="utf-8"?>
-<go:gDocsCustomXmlDataStorage xmlns:go="http://customooxmlschemas.google.com/" xmlns:r="http://schemas.openxmlformats.org/officeDocument/2006/relationships" uri="GoogleDocsCustomDataVersion2">
-  <go:docsCustomData xmlns:go="http://customooxmlschemas.google.com/" roundtripDataSignature="AMtx7mguqp8sDksAbElg7ArAShIzkf5G3g==">CgMxLjA4AHIhMWR3SXFaU21ERTNsLUxsLXpfYTcxLV9ZaGpfbjc2dEht</go:docsCustomData>
-</go:gDocsCustomXmlDataStorage>
-</file>
-
-<file path=customXML/itemProps1.xml><?xml version="1.0" encoding="utf-8"?>
-<ds:datastoreItem xmlns:ds="http://schemas.openxmlformats.org/officeDocument/2006/customXml" ds:itemID="{11111111-1234-1234-1234-123412341234}">
-  <ds:schemaRefs>
-    <ds:schemaRef ds:uri="http://schemas.openxmlformats.org/officeDocument/2006/relationships"/>
-    <ds:schemaRef ds:uri="http://customooxmlschemas.google.com/"/>
-  </ds:schemaRefs>
-</ds:datastoreItem>
 </file>
</xml_diff>

<commit_message>
Update meta template and generation
</commit_message>
<xml_diff>
--- a/templates/meta_template.docx
+++ b/templates/meta_template.docx
@@ -4,9 +4,6 @@
   <w:body>
     <w:p>
       <w:r>
-        <w:rPr>
-          <w:highlight w:val="yellow"/>
-        </w:rPr>
         <w:t>重點標</w:t>
       </w:r>
     </w:p>
@@ -15,27 +12,24 @@
         <w:t>{{TITLE_EN}}</w:t>
       </w:r>
     </w:p>
-    <w:p/>
-    <w:p>
-      <w:r>
-        <w:rPr>
-          <w:highlight w:val="yellow"/>
-        </w:rPr>
+    <w:p>
+      <w:r/>
+    </w:p>
+    <w:p>
+      <w:r>
         <w:t>名字職銜</w:t>
       </w:r>
     </w:p>
-    <w:p/>
     <w:p>
       <w:r>
         <w:t>{{PEOPLE}}</w:t>
       </w:r>
     </w:p>
-    <w:p/>
-    <w:p>
-      <w:r>
-        <w:rPr>
-          <w:highlight w:val="yellow"/>
-        </w:rPr>
+    <w:p>
+      <w:r/>
+    </w:p>
+    <w:p>
+      <w:r>
         <w:t>YT簡介</w:t>
       </w:r>
     </w:p>
@@ -43,6 +37,9 @@
       <w:r>
         <w:t>{{OVERVIEW_EN}}</w:t>
       </w:r>
+    </w:p>
+    <w:p>
+      <w:r/>
     </w:p>
     <w:sectPr>
       <w:pgSz w:w="11906" w:h="16838"/>

</xml_diff>

<commit_message>
Update meta template handling
</commit_message>
<xml_diff>
--- a/templates/meta_template.docx
+++ b/templates/meta_template.docx
@@ -1,9 +1,12 @@
 
 <file path=word/document.xml><?xml version="1.0" encoding="utf-8"?>
-<w:document xmlns:ns1="http://schemas.openxmlformats.org/markup-compatibility/2006" xmlns:w="http://schemas.openxmlformats.org/wordprocessingml/2006/main" ns1:Ignorable="w14 w15 w16se wp14">
+<w:document xmlns:w="http://schemas.openxmlformats.org/wordprocessingml/2006/main" xmlns:mc="http://schemas.openxmlformats.org/markup-compatibility/2006" xmlns:w14="http://schemas.microsoft.com/office/word/2010/wordml" xmlns:w15="http://schemas.microsoft.com/office/word/2012/wordml" xmlns:w16se="http://schemas.microsoft.com/office/word/2015/wordml/symex" xmlns:wp14="http://schemas.microsoft.com/office/word/2010/wordprocessingDrawing" mc:Ignorable="w14 w15 w16se wp14">
   <w:body>
     <w:p>
       <w:r>
+        <w:rPr>
+          <w:highlight w:val="yellow"/>
+        </w:rPr>
         <w:t>重點標</w:t>
       </w:r>
     </w:p>
@@ -17,6 +20,9 @@
     </w:p>
     <w:p>
       <w:r>
+        <w:rPr>
+          <w:highlight w:val="yellow"/>
+        </w:rPr>
         <w:t>名字職銜</w:t>
       </w:r>
     </w:p>
@@ -30,6 +36,9 @@
     </w:p>
     <w:p>
       <w:r>
+        <w:rPr>
+          <w:highlight w:val="yellow"/>
+        </w:rPr>
         <w:t>YT簡介</w:t>
       </w:r>
     </w:p>

</xml_diff>

<commit_message>
Centralize shared document style tokens
</commit_message>
<xml_diff>
--- a/templates/meta_template.docx
+++ b/templates/meta_template.docx
@@ -492,6 +492,9 @@
     <w:pPr>
       <w:widowControl w:val="0"/>
     </w:pPr>
+    <w:rPr>
+      <w:sz w:val="20"/>
+    </w:rPr>
   </w:style>
   <w:style w:type="character" w:default="1" w:styleId="a0">
     <w:name w:val="Default Paragraph Font"/>
@@ -617,6 +620,41 @@
     <w:rPr>
       <w:rFonts w:eastAsia="新細明體"/>
       <w:color w:val="0000FF"/>
+    </w:rPr>
+  </w:style>
+  <w:style w:type="character" w:customStyle="1" w:styleId="SectionLabelBlue10">
+    <w:name w:val="SectionLabelBlue10"/>
+    <w:rPr>
+      <w:color w:val="0070C0"/>
+      <w:sz w:val="20"/>
+    </w:rPr>
+  </w:style>
+  <w:style w:type="character" w:customStyle="1" w:styleId="SectionLabelBlue12">
+    <w:name w:val="SectionLabelBlue12"/>
+    <w:rPr>
+      <w:color w:val="0070C0"/>
+      <w:sz w:val="24"/>
+    </w:rPr>
+  </w:style>
+  <w:style w:type="character" w:customStyle="1" w:styleId="SectionLabelSmall">
+    <w:name w:val="SectionLabelSmall"/>
+    <w:rPr>
+      <w:color w:val="0070C0"/>
+      <w:sz w:val="20"/>
+    </w:rPr>
+  </w:style>
+  <w:style w:type="character" w:customStyle="1" w:styleId="SectionLabelLarge">
+    <w:name w:val="SectionLabelLarge"/>
+    <w:rPr>
+      <w:color w:val="0070C0"/>
+      <w:sz w:val="24"/>
+    </w:rPr>
+  </w:style>
+  <w:style w:type="character" w:customStyle="1" w:styleId="ReferenceLink">
+    <w:name w:val="ReferenceLink"/>
+    <w:rPr>
+      <w:color w:val="0563C1"/>
+      <w:sz w:val="20"/>
     </w:rPr>
   </w:style>
 </w:styles>

</xml_diff>

<commit_message>
Restore Calibri font mapping
</commit_message>
<xml_diff>
--- a/templates/meta_template.docx
+++ b/templates/meta_template.docx
@@ -493,7 +493,7 @@
       <w:widowControl w:val="0"/>
     </w:pPr>
     <w:rPr>
-      <w:rFonts w:ascii="細明體" w:hAnsi="細明體" w:cs="細明體" w:eastAsia="新細明體"/>
+      <w:rFonts w:ascii="Calibri" w:hAnsi="Calibri" w:cs="Calibri" w:eastAsia="新細明體"/>
       <w:sz w:val="24"/>
     </w:rPr>
   </w:style>
@@ -640,7 +640,7 @@
   <w:style w:type="character" w:customStyle="1" w:styleId="SectionLabelSmall">
     <w:name w:val="SectionLabelSmall"/>
     <w:rPr>
-      <w:rFonts w:ascii="細明體" w:hAnsi="細明體" w:cs="細明體" w:eastAsia="新細明體"/>
+      <w:rFonts w:ascii="Calibri" w:hAnsi="Calibri" w:cs="Calibri" w:eastAsia="新細明體"/>
       <w:color w:val="0070C0"/>
       <w:sz w:val="20"/>
     </w:rPr>
@@ -648,7 +648,7 @@
   <w:style w:type="character" w:customStyle="1" w:styleId="SectionLabelLarge">
     <w:name w:val="SectionLabelLarge"/>
     <w:rPr>
-      <w:rFonts w:ascii="細明體" w:hAnsi="細明體" w:cs="細明體" w:eastAsia="新細明體"/>
+      <w:rFonts w:ascii="Calibri" w:hAnsi="Calibri" w:cs="Calibri" w:eastAsia="新細明體"/>
       <w:color w:val="0070C0"/>
       <w:sz w:val="24"/>
     </w:rPr>
@@ -656,7 +656,7 @@
   <w:style w:type="character" w:customStyle="1" w:styleId="ReferenceLink">
     <w:name w:val="ReferenceLink"/>
     <w:rPr>
-      <w:rFonts w:ascii="細明體" w:hAnsi="細明體" w:cs="細明體" w:eastAsia="新細明體"/>
+      <w:rFonts w:ascii="Calibri" w:hAnsi="Calibri" w:cs="Calibri" w:eastAsia="新細明體"/>
       <w:color w:val="0563C1"/>
       <w:sz w:val="20"/>
     </w:rPr>

</xml_diff>